<commit_message>
cleaned up. removed all mentions of shocks. re ran models with clustering
</commit_message>
<xml_diff>
--- a/output/tables/table1_descriptives.docx
+++ b/output/tables/table1_descriptives.docx
@@ -302,104 +302,6 @@
             </w:pPr>
             <w:r>
               <w:t xml:space="preserve">16.8</w:t>
-            </w:r>
-          </w:p>
-        </w:tc>
-        <w:tc>
-          <w:tcPr/>
-          <w:p>
-            <w:pPr>
-              <w:pStyle w:val="Compact"/>
-            </w:pPr>
-          </w:p>
-        </w:tc>
-      </w:tr>
-      <w:tr>
-        <w:tc>
-          <w:tcPr/>
-          <w:p>
-            <w:pPr>
-              <w:pStyle w:val="Compact"/>
-            </w:pPr>
-            <w:r>
-              <w:t xml:space="preserve">Climate shock (0/1)</w:t>
-            </w:r>
-          </w:p>
-        </w:tc>
-        <w:tc>
-          <w:tcPr/>
-          <w:p>
-            <w:pPr>
-              <w:pStyle w:val="Compact"/>
-            </w:pPr>
-            <w:r>
-              <w:t xml:space="preserve">2</w:t>
-            </w:r>
-          </w:p>
-        </w:tc>
-        <w:tc>
-          <w:tcPr/>
-          <w:p>
-            <w:pPr>
-              <w:pStyle w:val="Compact"/>
-            </w:pPr>
-            <w:r>
-              <w:t xml:space="preserve">0</w:t>
-            </w:r>
-          </w:p>
-        </w:tc>
-        <w:tc>
-          <w:tcPr/>
-          <w:p>
-            <w:pPr>
-              <w:pStyle w:val="Compact"/>
-            </w:pPr>
-            <w:r>
-              <w:t xml:space="preserve">0.1</w:t>
-            </w:r>
-          </w:p>
-        </w:tc>
-        <w:tc>
-          <w:tcPr/>
-          <w:p>
-            <w:pPr>
-              <w:pStyle w:val="Compact"/>
-            </w:pPr>
-            <w:r>
-              <w:t xml:space="preserve">0.3</w:t>
-            </w:r>
-          </w:p>
-        </w:tc>
-        <w:tc>
-          <w:tcPr/>
-          <w:p>
-            <w:pPr>
-              <w:pStyle w:val="Compact"/>
-            </w:pPr>
-            <w:r>
-              <w:t xml:space="preserve">0.0</w:t>
-            </w:r>
-          </w:p>
-        </w:tc>
-        <w:tc>
-          <w:tcPr/>
-          <w:p>
-            <w:pPr>
-              <w:pStyle w:val="Compact"/>
-            </w:pPr>
-            <w:r>
-              <w:t xml:space="preserve">0.0</w:t>
-            </w:r>
-          </w:p>
-        </w:tc>
-        <w:tc>
-          <w:tcPr/>
-          <w:p>
-            <w:pPr>
-              <w:pStyle w:val="Compact"/>
-            </w:pPr>
-            <w:r>
-              <w:t xml:space="preserve">1.0</w:t>
             </w:r>
           </w:p>
         </w:tc>

</xml_diff>